<commit_message>
Lab 10 worklog: Mac-friendly python3 commands + venv setup steps
Co-Authored-By: Claude Opus 5.5 <noreply@anthropic.com>
Claude-Session: https://claude.ai/code/session_0189EmTvdNp75fbiYJaiwSjL
</commit_message>
<xml_diff>
--- a/Lab 10/Lab10_Worklog_Week10.docx
+++ b/Lab 10/Lab10_Worklog_Week10.docx
@@ -2970,7 +2970,79 @@
           <w:i/>
           <w:sz w:val="18"/>
         </w:rPr>
-        <w:t xml:space="preserve">Figures 10.1–10.4 come straight out of my notebook. The yellow boxes are screenshots I still need to take on my laptop. Set-up first: in the terminal, in the LabChallenge folder, run </w:t>
+        <w:t xml:space="preserve">Figures 10.1–10.4 come straight out of my notebook. The yellow boxes are screenshots I still need to take on my laptop. </w:t>
+      </w:r>
+      <w:r>
+        <w:rPr>
+          <w:rFonts w:ascii="Arial" w:hAnsi="Arial" w:cs="Arial" w:eastAsia="Arial"/>
+          <w:b/>
+          <w:i/>
+          <w:sz w:val="18"/>
+        </w:rPr>
+        <w:t xml:space="preserve">Set-up first (Mac – use </w:t>
+      </w:r>
+      <w:r>
+        <w:rPr>
+          <w:rFonts w:ascii="Consolas" w:hAnsi="Consolas" w:cs="Consolas" w:eastAsia="Consolas"/>
+          <w:b/>
+          <w:i/>
+          <w:sz w:val="17"/>
+        </w:rPr>
+        <w:t>python3</w:t>
+      </w:r>
+      <w:r>
+        <w:rPr>
+          <w:rFonts w:ascii="Arial" w:hAnsi="Arial" w:cs="Arial" w:eastAsia="Arial"/>
+          <w:b/>
+          <w:i/>
+          <w:sz w:val="18"/>
+        </w:rPr>
+        <w:t xml:space="preserve">, not </w:t>
+      </w:r>
+      <w:r>
+        <w:rPr>
+          <w:rFonts w:ascii="Consolas" w:hAnsi="Consolas" w:cs="Consolas" w:eastAsia="Consolas"/>
+          <w:b/>
+          <w:i/>
+          <w:sz w:val="17"/>
+        </w:rPr>
+        <w:t>python</w:t>
+      </w:r>
+      <w:r>
+        <w:rPr>
+          <w:rFonts w:ascii="Arial" w:hAnsi="Arial" w:cs="Arial" w:eastAsia="Arial"/>
+          <w:b/>
+          <w:i/>
+          <w:sz w:val="18"/>
+        </w:rPr>
+        <w:t>):</w:t>
+      </w:r>
+      <w:r>
+        <w:rPr>
+          <w:rFonts w:ascii="Arial" w:hAnsi="Arial" w:cs="Arial" w:eastAsia="Arial"/>
+          <w:b w:val="0"/>
+          <w:i/>
+          <w:sz w:val="18"/>
+        </w:rPr>
+        <w:t xml:space="preserve"> open a terminal in the LabChallenge folder (in VS Code: Terminal → New Terminal) and run </w:t>
+      </w:r>
+      <w:r>
+        <w:rPr>
+          <w:rFonts w:ascii="Consolas" w:hAnsi="Consolas" w:cs="Consolas" w:eastAsia="Consolas"/>
+          <w:b w:val="0"/>
+          <w:i/>
+          <w:sz w:val="17"/>
+        </w:rPr>
+        <w:t>python3 -m venv .venv</w:t>
+      </w:r>
+      <w:r>
+        <w:rPr>
+          <w:rFonts w:ascii="Arial" w:hAnsi="Arial" w:cs="Arial" w:eastAsia="Arial"/>
+          <w:b w:val="0"/>
+          <w:i/>
+          <w:sz w:val="18"/>
+        </w:rPr>
+        <w:t xml:space="preserve"> (only if there's no .venv folder yet), then </w:t>
       </w:r>
       <w:r>
         <w:rPr>
@@ -2988,7 +3060,25 @@
           <w:i/>
           <w:sz w:val="18"/>
         </w:rPr>
-        <w:t xml:space="preserve"> then </w:t>
+        <w:t xml:space="preserve"> – the line must now start with </w:t>
+      </w:r>
+      <w:r>
+        <w:rPr>
+          <w:rFonts w:ascii="Arial" w:hAnsi="Arial" w:cs="Arial" w:eastAsia="Arial"/>
+          <w:b/>
+          <w:i/>
+          <w:sz w:val="18"/>
+        </w:rPr>
+        <w:t>(.venv)</w:t>
+      </w:r>
+      <w:r>
+        <w:rPr>
+          <w:rFonts w:ascii="Arial" w:hAnsi="Arial" w:cs="Arial" w:eastAsia="Arial"/>
+          <w:b w:val="0"/>
+          <w:i/>
+          <w:sz w:val="18"/>
+        </w:rPr>
+        <w:t xml:space="preserve"> – then </w:t>
       </w:r>
       <w:r>
         <w:rPr>
@@ -2997,7 +3087,7 @@
           <w:i/>
           <w:sz w:val="17"/>
         </w:rPr>
-        <w:t>pip install pygad kivy</w:t>
+        <w:t>python3 -m pip install pygad kivy matplotlib python-docx pillow</w:t>
       </w:r>
       <w:r>
         <w:rPr>
@@ -3006,25 +3096,7 @@
           <w:i/>
           <w:sz w:val="18"/>
         </w:rPr>
-        <w:t xml:space="preserve"> (Windows: </w:t>
-      </w:r>
-      <w:r>
-        <w:rPr>
-          <w:rFonts w:ascii="Consolas" w:hAnsi="Consolas" w:cs="Consolas" w:eastAsia="Consolas"/>
-          <w:b w:val="0"/>
-          <w:i/>
-          <w:sz w:val="17"/>
-        </w:rPr>
-        <w:t>.venv\Scripts\activate</w:t>
-      </w:r>
-      <w:r>
-        <w:rPr>
-          <w:rFonts w:ascii="Arial" w:hAnsi="Arial" w:cs="Arial" w:eastAsia="Arial"/>
-          <w:b w:val="0"/>
-          <w:i/>
-          <w:sz w:val="18"/>
-        </w:rPr>
-        <w:t xml:space="preserve">). Then </w:t>
+        <w:t xml:space="preserve">, then </w:t>
       </w:r>
       <w:r>
         <w:rPr>
@@ -3042,7 +3114,25 @@
           <w:i/>
           <w:sz w:val="18"/>
         </w:rPr>
-        <w:t xml:space="preserve"> and do the steps below.</w:t>
+        <w:t xml:space="preserve">. Every new terminal: run </w:t>
+      </w:r>
+      <w:r>
+        <w:rPr>
+          <w:rFonts w:ascii="Consolas" w:hAnsi="Consolas" w:cs="Consolas" w:eastAsia="Consolas"/>
+          <w:b w:val="0"/>
+          <w:i/>
+          <w:sz w:val="17"/>
+        </w:rPr>
+        <w:t>source .venv/bin/activate</w:t>
+      </w:r>
+      <w:r>
+        <w:rPr>
+          <w:rFonts w:ascii="Arial" w:hAnsi="Arial" w:cs="Arial" w:eastAsia="Arial"/>
+          <w:b w:val="0"/>
+          <w:i/>
+          <w:sz w:val="18"/>
+        </w:rPr>
+        <w:t xml:space="preserve"> again first.</w:t>
       </w:r>
     </w:p>
     <w:p>
@@ -3339,7 +3429,7 @@
                 <w:i w:val="0"/>
                 <w:sz w:val="16"/>
               </w:rPr>
-              <w:t>pip install pygad kivy</w:t>
+              <w:t>python3 -m pip install pygad kivy matplotlib python-docx pillow</w:t>
             </w:r>
             <w:r>
               <w:rPr>
@@ -3357,16 +3447,16 @@
                 <w:i w:val="0"/>
                 <w:sz w:val="16"/>
               </w:rPr>
-              <w:t>python -c "import pygad; print(pygad.__version__)"</w:t>
-            </w:r>
-            <w:r>
-              <w:rPr>
-                <w:rFonts w:ascii="Arial" w:hAnsi="Arial" w:cs="Arial" w:eastAsia="Arial"/>
-                <w:b w:val="0"/>
-                <w:i w:val="0"/>
-                <w:sz w:val="17"/>
-              </w:rPr>
-              <w:t xml:space="preserve"> and include the version line.</w:t>
+              <w:t>python3 -c "import pygad; print(pygad.__version__)"</w:t>
+            </w:r>
+            <w:r>
+              <w:rPr>
+                <w:rFonts w:ascii="Arial" w:hAnsi="Arial" w:cs="Arial" w:eastAsia="Arial"/>
+                <w:b w:val="0"/>
+                <w:i w:val="0"/>
+                <w:sz w:val="17"/>
+              </w:rPr>
+              <w:t xml:space="preserve"> (with a space after python3) and include the version line.</w:t>
             </w:r>
           </w:p>
           <w:p>
@@ -3408,7 +3498,7 @@
                 <w:i/>
                 <w:sz w:val="15"/>
               </w:rPr>
-              <w:t>python _tools/insert_screenshots.py</w:t>
+              <w:t>python3 _tools/insert_screenshots.py</w:t>
             </w:r>
             <w:r>
               <w:rPr>
@@ -3508,7 +3598,7 @@
                 <w:i w:val="0"/>
                 <w:sz w:val="16"/>
               </w:rPr>
-              <w:t>python fitting_linear_model.py</w:t>
+              <w:t>python3 fitting_linear_model.py</w:t>
             </w:r>
             <w:r>
               <w:rPr>
@@ -3595,7 +3685,7 @@
                 <w:i/>
                 <w:sz w:val="15"/>
               </w:rPr>
-              <w:t>python _tools/insert_screenshots.py</w:t>
+              <w:t>python3 _tools/insert_screenshots.py</w:t>
             </w:r>
             <w:r>
               <w:rPr>
@@ -3695,7 +3785,7 @@
                 <w:i w:val="0"/>
                 <w:sz w:val="16"/>
               </w:rPr>
-              <w:t>python 8_queen_puzzle.py</w:t>
+              <w:t>python3 8_queen_puzzle.py</w:t>
             </w:r>
             <w:r>
               <w:rPr>
@@ -3782,7 +3872,7 @@
                 <w:i/>
                 <w:sz w:val="15"/>
               </w:rPr>
-              <w:t>python _tools/insert_screenshots.py</w:t>
+              <w:t>python3 _tools/insert_screenshots.py</w:t>
             </w:r>
             <w:r>
               <w:rPr>
@@ -3969,7 +4059,7 @@
                 <w:i/>
                 <w:sz w:val="15"/>
               </w:rPr>
-              <w:t>python _tools/insert_screenshots.py</w:t>
+              <w:t>python3 _tools/insert_screenshots.py</w:t>
             </w:r>
             <w:r>
               <w:rPr>
@@ -4120,7 +4210,7 @@
                 <w:i/>
                 <w:sz w:val="15"/>
               </w:rPr>
-              <w:t>python _tools/insert_screenshots.py</w:t>
+              <w:t>python3 _tools/insert_screenshots.py</w:t>
             </w:r>
             <w:r>
               <w:rPr>
@@ -4253,7 +4343,7 @@
                 <w:i/>
                 <w:sz w:val="15"/>
               </w:rPr>
-              <w:t>python _tools/insert_screenshots.py</w:t>
+              <w:t>python3 _tools/insert_screenshots.py</w:t>
             </w:r>
             <w:r>
               <w:rPr>
@@ -4458,7 +4548,7 @@
                 <w:i/>
                 <w:sz w:val="15"/>
               </w:rPr>
-              <w:t>python _tools/insert_screenshots.py</w:t>
+              <w:t>python3 _tools/insert_screenshots.py</w:t>
             </w:r>
             <w:r>
               <w:rPr>
@@ -4526,7 +4616,7 @@
           <w:i w:val="0"/>
           <w:sz w:val="18"/>
         </w:rPr>
-        <w:t xml:space="preserve"> with those names, and from the LabChallenge folder run </w:t>
+        <w:t xml:space="preserve"> with those names, close Word, go back to the LabChallenge folder (</w:t>
       </w:r>
       <w:r>
         <w:rPr>
@@ -4535,7 +4625,25 @@
           <w:i w:val="0"/>
           <w:sz w:val="17"/>
         </w:rPr>
-        <w:t>python _tools/insert_screenshots.py 10</w:t>
+        <w:t>cd ..</w:t>
+      </w:r>
+      <w:r>
+        <w:rPr>
+          <w:rFonts w:ascii="Arial" w:hAnsi="Arial" w:cs="Arial" w:eastAsia="Arial"/>
+          <w:b w:val="0"/>
+          <w:i w:val="0"/>
+          <w:sz w:val="18"/>
+        </w:rPr>
+        <w:t xml:space="preserve">) with (.venv) on, and run </w:t>
+      </w:r>
+      <w:r>
+        <w:rPr>
+          <w:rFonts w:ascii="Consolas" w:hAnsi="Consolas" w:cs="Consolas" w:eastAsia="Consolas"/>
+          <w:b w:val="0"/>
+          <w:i w:val="0"/>
+          <w:sz w:val="17"/>
+        </w:rPr>
+        <w:t>python3 _tools/insert_screenshots.py 10</w:t>
       </w:r>
       <w:r>
         <w:rPr>
@@ -4553,7 +4661,7 @@
           <w:i w:val="0"/>
           <w:sz w:val="17"/>
         </w:rPr>
-        <w:t>python _tools/tick_checklist.py 10 7 8 9 10</w:t>
+        <w:t>python3 _tools/tick_checklist.py 10 7 8 9 10</w:t>
       </w:r>
       <w:r>
         <w:rPr>
@@ -4571,7 +4679,7 @@
           <w:i w:val="0"/>
           <w:sz w:val="17"/>
         </w:rPr>
-        <w:t>python _tools/make_handin.py 10</w:t>
+        <w:t>python3 _tools/make_handin.py 10</w:t>
       </w:r>
       <w:r>
         <w:rPr>

</xml_diff>